<commit_message>
rebuilding site Wed Oct  7 15:57:07 EDT 2020
</commit_message>
<xml_diff>
--- a/files/AB_CV.docx
+++ b/files/AB_CV.docx
@@ -1,6 +1,6 @@
 
 <file path=word/document.xml><?xml version="1.0" encoding="utf-8"?>
-<w:document xmlns:wpc="http://schemas.microsoft.com/office/word/2010/wordprocessingCanvas" xmlns:mo="http://schemas.microsoft.com/office/mac/office/2008/main" xmlns:mc="http://schemas.openxmlformats.org/markup-compatibility/2006" xmlns:mv="urn:schemas-microsoft-com:mac:vml" xmlns:o="urn:schemas-microsoft-com:office:office" xmlns:r="http://schemas.openxmlformats.org/officeDocument/2006/relationships" xmlns:m="http://schemas.openxmlformats.org/officeDocument/2006/math" xmlns:v="urn:schemas-microsoft-com:vml" xmlns:wp14="http://schemas.microsoft.com/office/word/2010/wordprocessingDrawing" xmlns:wp="http://schemas.openxmlformats.org/drawingml/2006/wordprocessingDrawing" xmlns:w10="urn:schemas-microsoft-com:office:word" xmlns:w="http://schemas.openxmlformats.org/wordprocessingml/2006/main" xmlns:w14="http://schemas.microsoft.com/office/word/2010/wordml" xmlns:w15="http://schemas.microsoft.com/office/word/2012/wordml" xmlns:wpg="http://schemas.microsoft.com/office/word/2010/wordprocessingGroup" xmlns:wpi="http://schemas.microsoft.com/office/word/2010/wordprocessingInk" xmlns:wne="http://schemas.microsoft.com/office/word/2006/wordml" xmlns:wps="http://schemas.microsoft.com/office/word/2010/wordprocessingShape" mc:Ignorable="w14 w15 wp14">
+<w:document xmlns:wpc="http://schemas.microsoft.com/office/word/2010/wordprocessingCanvas" xmlns:cx="http://schemas.microsoft.com/office/drawing/2014/chartex" xmlns:cx1="http://schemas.microsoft.com/office/drawing/2015/9/8/chartex" xmlns:cx2="http://schemas.microsoft.com/office/drawing/2015/10/21/chartex" xmlns:cx3="http://schemas.microsoft.com/office/drawing/2016/5/9/chartex" xmlns:cx4="http://schemas.microsoft.com/office/drawing/2016/5/10/chartex" xmlns:cx5="http://schemas.microsoft.com/office/drawing/2016/5/11/chartex" xmlns:cx6="http://schemas.microsoft.com/office/drawing/2016/5/12/chartex" xmlns:cx7="http://schemas.microsoft.com/office/drawing/2016/5/13/chartex" xmlns:cx8="http://schemas.microsoft.com/office/drawing/2016/5/14/chartex" xmlns:mc="http://schemas.openxmlformats.org/markup-compatibility/2006" xmlns:aink="http://schemas.microsoft.com/office/drawing/2016/ink" xmlns:am3d="http://schemas.microsoft.com/office/drawing/2017/model3d" xmlns:o="urn:schemas-microsoft-com:office:office" xmlns:r="http://schemas.openxmlformats.org/officeDocument/2006/relationships" xmlns:m="http://schemas.openxmlformats.org/officeDocument/2006/math" xmlns:v="urn:schemas-microsoft-com:vml" xmlns:wp14="http://schemas.microsoft.com/office/word/2010/wordprocessingDrawing" xmlns:wp="http://schemas.openxmlformats.org/drawingml/2006/wordprocessingDrawing" xmlns:w10="urn:schemas-microsoft-com:office:word" xmlns:w="http://schemas.openxmlformats.org/wordprocessingml/2006/main" xmlns:w14="http://schemas.microsoft.com/office/word/2010/wordml" xmlns:w15="http://schemas.microsoft.com/office/word/2012/wordml" xmlns:w16cid="http://schemas.microsoft.com/office/word/2016/wordml/cid" xmlns:w16se="http://schemas.microsoft.com/office/word/2015/wordml/symex" xmlns:wpg="http://schemas.microsoft.com/office/word/2010/wordprocessingGroup" xmlns:wpi="http://schemas.microsoft.com/office/word/2010/wordprocessingInk" xmlns:wne="http://schemas.microsoft.com/office/word/2006/wordml" xmlns:wps="http://schemas.microsoft.com/office/word/2010/wordprocessingShape" mc:Ignorable="w14 w15 w16se w16cid wp14">
   <w:body>
     <w:p>
       <w:pPr>
@@ -12,8 +12,6 @@
           <w:szCs w:val="48"/>
         </w:rPr>
       </w:pPr>
-      <w:bookmarkStart w:id="0" w:name="_GoBack"/>
-      <w:bookmarkEnd w:id="0"/>
       <w:r>
         <w:rPr>
           <w:rFonts w:ascii="Garamond" w:hAnsi="Garamond"/>
@@ -258,7 +256,66 @@
           <w:sz w:val="24"/>
           <w:szCs w:val="24"/>
         </w:rPr>
-        <w:t xml:space="preserve">. </w:t>
+        <w:t>. Sci</w:t>
+      </w:r>
+      <w:r>
+        <w:rPr>
+          <w:rFonts w:ascii="Garamond" w:hAnsi="Garamond"/>
+          <w:sz w:val="24"/>
+          <w:szCs w:val="24"/>
+        </w:rPr>
+        <w:tab/>
+      </w:r>
+      <w:r>
+        <w:rPr>
+          <w:rFonts w:ascii="Garamond" w:hAnsi="Garamond"/>
+          <w:sz w:val="24"/>
+          <w:szCs w:val="24"/>
+        </w:rPr>
+        <w:tab/>
+        <w:t>Columbia University</w:t>
+      </w:r>
+    </w:p>
+    <w:p>
+      <w:pPr>
+        <w:rPr>
+          <w:rFonts w:ascii="Garamond" w:hAnsi="Garamond"/>
+          <w:sz w:val="24"/>
+          <w:szCs w:val="24"/>
+        </w:rPr>
+      </w:pPr>
+      <w:r>
+        <w:rPr>
+          <w:rFonts w:ascii="Garamond" w:hAnsi="Garamond"/>
+          <w:sz w:val="24"/>
+          <w:szCs w:val="24"/>
+        </w:rPr>
+        <w:t>2017</w:t>
+      </w:r>
+      <w:r>
+        <w:rPr>
+          <w:rFonts w:ascii="Garamond" w:hAnsi="Garamond"/>
+          <w:sz w:val="24"/>
+          <w:szCs w:val="24"/>
+        </w:rPr>
+        <w:tab/>
+      </w:r>
+      <w:r>
+        <w:rPr>
+          <w:rFonts w:ascii="Garamond" w:hAnsi="Garamond"/>
+          <w:sz w:val="24"/>
+          <w:szCs w:val="24"/>
+        </w:rPr>
+        <w:tab/>
+      </w:r>
+      <w:r>
+        <w:rPr>
+          <w:rFonts w:ascii="Garamond" w:hAnsi="Garamond"/>
+          <w:sz w:val="24"/>
+          <w:szCs w:val="24"/>
+        </w:rPr>
+        <w:tab/>
+        <w:t xml:space="preserve">M.Phil. Earth &amp; </w:t>
       </w:r>
       <w:proofErr w:type="spellStart"/>
       <w:r>
@@ -267,7 +324,7 @@
           <w:sz w:val="24"/>
           <w:szCs w:val="24"/>
         </w:rPr>
-        <w:t>Sci</w:t>
+        <w:t>Envi</w:t>
       </w:r>
       <w:proofErr w:type="spellEnd"/>
       <w:r>
@@ -276,87 +333,8 @@
           <w:sz w:val="24"/>
           <w:szCs w:val="24"/>
         </w:rPr>
-        <w:tab/>
-      </w:r>
-      <w:r>
-        <w:rPr>
-          <w:rFonts w:ascii="Garamond" w:hAnsi="Garamond"/>
-          <w:sz w:val="24"/>
-          <w:szCs w:val="24"/>
-        </w:rPr>
-        <w:tab/>
-        <w:t>Columbia University</w:t>
-      </w:r>
-    </w:p>
-    <w:p>
-      <w:pPr>
-        <w:rPr>
-          <w:rFonts w:ascii="Garamond" w:hAnsi="Garamond"/>
-          <w:sz w:val="24"/>
-          <w:szCs w:val="24"/>
-        </w:rPr>
-      </w:pPr>
-      <w:r>
-        <w:rPr>
-          <w:rFonts w:ascii="Garamond" w:hAnsi="Garamond"/>
-          <w:sz w:val="24"/>
-          <w:szCs w:val="24"/>
-        </w:rPr>
-        <w:t>2017</w:t>
-      </w:r>
-      <w:r>
-        <w:rPr>
-          <w:rFonts w:ascii="Garamond" w:hAnsi="Garamond"/>
-          <w:sz w:val="24"/>
-          <w:szCs w:val="24"/>
-        </w:rPr>
-        <w:tab/>
-      </w:r>
-      <w:r>
-        <w:rPr>
-          <w:rFonts w:ascii="Garamond" w:hAnsi="Garamond"/>
-          <w:sz w:val="24"/>
-          <w:szCs w:val="24"/>
-        </w:rPr>
-        <w:tab/>
-      </w:r>
-      <w:r>
-        <w:rPr>
-          <w:rFonts w:ascii="Garamond" w:hAnsi="Garamond"/>
-          <w:sz w:val="24"/>
-          <w:szCs w:val="24"/>
-        </w:rPr>
-        <w:tab/>
-        <w:t xml:space="preserve">M.Phil. Earth &amp; </w:t>
-      </w:r>
-      <w:proofErr w:type="spellStart"/>
-      <w:r>
-        <w:rPr>
-          <w:rFonts w:ascii="Garamond" w:hAnsi="Garamond"/>
-          <w:sz w:val="24"/>
-          <w:szCs w:val="24"/>
-        </w:rPr>
-        <w:t>Envi</w:t>
-      </w:r>
-      <w:proofErr w:type="spellEnd"/>
-      <w:r>
-        <w:rPr>
-          <w:rFonts w:ascii="Garamond" w:hAnsi="Garamond"/>
-          <w:sz w:val="24"/>
-          <w:szCs w:val="24"/>
-        </w:rPr>
-        <w:t xml:space="preserve">. </w:t>
-      </w:r>
-      <w:proofErr w:type="spellStart"/>
-      <w:r>
-        <w:rPr>
-          <w:rFonts w:ascii="Garamond" w:hAnsi="Garamond"/>
-          <w:sz w:val="24"/>
-          <w:szCs w:val="24"/>
-        </w:rPr>
-        <w:t>Sci</w:t>
-      </w:r>
-      <w:proofErr w:type="spellEnd"/>
+        <w:t>. Sci</w:t>
+      </w:r>
       <w:r>
         <w:rPr>
           <w:rFonts w:ascii="Garamond" w:hAnsi="Garamond"/>
@@ -1650,6 +1628,48 @@
           <w:sz w:val="24"/>
           <w:szCs w:val="24"/>
         </w:rPr>
+        <w:t>2019</w:t>
+      </w:r>
+      <w:r>
+        <w:rPr>
+          <w:rFonts w:ascii="Garamond" w:hAnsi="Garamond"/>
+          <w:sz w:val="24"/>
+          <w:szCs w:val="24"/>
+        </w:rPr>
+        <w:tab/>
+      </w:r>
+      <w:r>
+        <w:rPr>
+          <w:rFonts w:ascii="Garamond" w:hAnsi="Garamond"/>
+          <w:sz w:val="24"/>
+          <w:szCs w:val="24"/>
+        </w:rPr>
+        <w:tab/>
+      </w:r>
+      <w:r>
+        <w:rPr>
+          <w:rFonts w:ascii="Garamond" w:hAnsi="Garamond"/>
+          <w:sz w:val="24"/>
+          <w:szCs w:val="24"/>
+        </w:rPr>
+        <w:tab/>
+        <w:t>Grand Prize in the NASA Data Visualisation and Storytelling Competition</w:t>
+      </w:r>
+    </w:p>
+    <w:p>
+      <w:pPr>
+        <w:rPr>
+          <w:rFonts w:ascii="Garamond" w:hAnsi="Garamond"/>
+          <w:sz w:val="24"/>
+          <w:szCs w:val="24"/>
+        </w:rPr>
+      </w:pPr>
+      <w:r>
+        <w:rPr>
+          <w:rFonts w:ascii="Garamond" w:hAnsi="Garamond"/>
+          <w:sz w:val="24"/>
+          <w:szCs w:val="24"/>
+        </w:rPr>
         <w:t>2018</w:t>
       </w:r>
       <w:r>
@@ -1682,7 +1702,55 @@
           <w:sz w:val="24"/>
           <w:szCs w:val="24"/>
         </w:rPr>
-        <w:t>Outstanding student presentation award, AGU Fall Meeting</w:t>
+        <w:t xml:space="preserve">Outstanding </w:t>
+      </w:r>
+      <w:r>
+        <w:rPr>
+          <w:rFonts w:ascii="Garamond" w:hAnsi="Garamond"/>
+          <w:sz w:val="24"/>
+          <w:szCs w:val="24"/>
+        </w:rPr>
+        <w:t>S</w:t>
+      </w:r>
+      <w:r>
+        <w:rPr>
+          <w:rFonts w:ascii="Garamond" w:hAnsi="Garamond"/>
+          <w:sz w:val="24"/>
+          <w:szCs w:val="24"/>
+        </w:rPr>
+        <w:t xml:space="preserve">tudent </w:t>
+      </w:r>
+      <w:r>
+        <w:rPr>
+          <w:rFonts w:ascii="Garamond" w:hAnsi="Garamond"/>
+          <w:sz w:val="24"/>
+          <w:szCs w:val="24"/>
+        </w:rPr>
+        <w:t>P</w:t>
+      </w:r>
+      <w:r>
+        <w:rPr>
+          <w:rFonts w:ascii="Garamond" w:hAnsi="Garamond"/>
+          <w:sz w:val="24"/>
+          <w:szCs w:val="24"/>
+        </w:rPr>
+        <w:t xml:space="preserve">resentation </w:t>
+      </w:r>
+      <w:r>
+        <w:rPr>
+          <w:rFonts w:ascii="Garamond" w:hAnsi="Garamond"/>
+          <w:sz w:val="24"/>
+          <w:szCs w:val="24"/>
+        </w:rPr>
+        <w:t>A</w:t>
+      </w:r>
+      <w:r>
+        <w:rPr>
+          <w:rFonts w:ascii="Garamond" w:hAnsi="Garamond"/>
+          <w:sz w:val="24"/>
+          <w:szCs w:val="24"/>
+        </w:rPr>
+        <w:t>ward, AGU Fall Meeting</w:t>
       </w:r>
     </w:p>
     <w:p>
@@ -1897,7 +1965,17 @@
           <w:sz w:val="24"/>
           <w:szCs w:val="24"/>
         </w:rPr>
-        <w:t>Harkness Prize for graduating first in my class, Earth Sciences Dept., Cambridge</w:t>
+        <w:t>Harkness Prize for graduating first in my class, Earth Sciences Dept.,</w:t>
+      </w:r>
+      <w:bookmarkStart w:id="0" w:name="_GoBack"/>
+      <w:bookmarkEnd w:id="0"/>
+      <w:r>
+        <w:rPr>
+          <w:rFonts w:ascii="Garamond" w:hAnsi="Garamond"/>
+          <w:sz w:val="24"/>
+          <w:szCs w:val="24"/>
+        </w:rPr>
+        <w:t xml:space="preserve"> Cambridge</w:t>
       </w:r>
     </w:p>
     <w:p>
@@ -2110,25 +2188,7 @@
           <w:sz w:val="24"/>
           <w:szCs w:val="24"/>
         </w:rPr>
-        <w:t xml:space="preserve">e in </w:t>
-      </w:r>
-      <w:proofErr w:type="spellStart"/>
-      <w:r>
-        <w:rPr>
-          <w:rFonts w:ascii="Garamond" w:hAnsi="Garamond"/>
-          <w:sz w:val="24"/>
-          <w:szCs w:val="24"/>
-        </w:rPr>
-        <w:t>Gros</w:t>
-      </w:r>
-      <w:proofErr w:type="spellEnd"/>
-      <w:r>
-        <w:rPr>
-          <w:rFonts w:ascii="Garamond" w:hAnsi="Garamond"/>
-          <w:sz w:val="24"/>
-          <w:szCs w:val="24"/>
-        </w:rPr>
-        <w:t xml:space="preserve"> </w:t>
+        <w:t xml:space="preserve">e in Gros </w:t>
       </w:r>
       <w:proofErr w:type="spellStart"/>
       <w:r>
@@ -2410,19 +2470,208 @@
       <w:pPr>
         <w:rPr>
           <w:rFonts w:ascii="Garamond" w:hAnsi="Garamond"/>
-          <w:sz w:val="24"/>
-          <w:szCs w:val="24"/>
-        </w:rPr>
-      </w:pPr>
-      <w:r>
-        <w:rPr>
-          <w:rFonts w:ascii="Garamond" w:hAnsi="Garamond"/>
           <w:b/>
           <w:sz w:val="24"/>
           <w:szCs w:val="24"/>
         </w:rPr>
+      </w:pPr>
+    </w:p>
+    <w:p>
+      <w:pPr>
+        <w:rPr>
+          <w:rFonts w:ascii="Garamond" w:hAnsi="Garamond"/>
+          <w:b/>
+          <w:sz w:val="24"/>
+          <w:szCs w:val="24"/>
+        </w:rPr>
+      </w:pPr>
+      <w:r>
+        <w:rPr>
+          <w:rFonts w:ascii="Garamond" w:hAnsi="Garamond"/>
+          <w:sz w:val="24"/>
+          <w:szCs w:val="24"/>
+        </w:rPr>
+        <w:t>Newcombe</w:t>
+      </w:r>
+      <w:r>
+        <w:rPr>
+          <w:rFonts w:ascii="Garamond" w:hAnsi="Garamond"/>
+          <w:sz w:val="24"/>
+          <w:szCs w:val="24"/>
+        </w:rPr>
+        <w:t>, M.</w:t>
+      </w:r>
+      <w:r>
+        <w:rPr>
+          <w:rFonts w:ascii="Garamond" w:hAnsi="Garamond"/>
+          <w:sz w:val="24"/>
+          <w:szCs w:val="24"/>
+        </w:rPr>
+        <w:t>, Plank</w:t>
+      </w:r>
+      <w:r>
+        <w:rPr>
+          <w:rFonts w:ascii="Garamond" w:hAnsi="Garamond"/>
+          <w:sz w:val="24"/>
+          <w:szCs w:val="24"/>
+        </w:rPr>
+        <w:t>, T.</w:t>
+      </w:r>
+      <w:r>
+        <w:rPr>
+          <w:rFonts w:ascii="Garamond" w:hAnsi="Garamond"/>
+          <w:sz w:val="24"/>
+          <w:szCs w:val="24"/>
+        </w:rPr>
+        <w:t xml:space="preserve">, </w:t>
+      </w:r>
+      <w:r>
+        <w:rPr>
+          <w:rFonts w:ascii="Garamond" w:hAnsi="Garamond"/>
+          <w:b/>
+          <w:sz w:val="24"/>
+          <w:szCs w:val="24"/>
+        </w:rPr>
+        <w:t>Barth</w:t>
+      </w:r>
+      <w:r>
+        <w:rPr>
+          <w:rFonts w:ascii="Garamond" w:hAnsi="Garamond"/>
+          <w:b/>
+          <w:sz w:val="24"/>
+          <w:szCs w:val="24"/>
+        </w:rPr>
+        <w:t>, A.</w:t>
+      </w:r>
+      <w:r>
+        <w:rPr>
+          <w:rFonts w:ascii="Garamond" w:hAnsi="Garamond"/>
+          <w:sz w:val="24"/>
+          <w:szCs w:val="24"/>
+        </w:rPr>
+        <w:t xml:space="preserve">, </w:t>
+      </w:r>
+      <w:proofErr w:type="spellStart"/>
+      <w:r>
+        <w:rPr>
+          <w:rFonts w:ascii="Garamond" w:hAnsi="Garamond"/>
+          <w:sz w:val="24"/>
+          <w:szCs w:val="24"/>
+        </w:rPr>
+        <w:t>Asimow</w:t>
+      </w:r>
+      <w:proofErr w:type="spellEnd"/>
+      <w:r>
+        <w:rPr>
+          <w:rFonts w:ascii="Garamond" w:hAnsi="Garamond"/>
+          <w:sz w:val="24"/>
+          <w:szCs w:val="24"/>
+        </w:rPr>
+        <w:t>, P.</w:t>
+      </w:r>
+      <w:r>
+        <w:rPr>
+          <w:rFonts w:ascii="Garamond" w:hAnsi="Garamond"/>
+          <w:sz w:val="24"/>
+          <w:szCs w:val="24"/>
+        </w:rPr>
+        <w:t xml:space="preserve">, </w:t>
+      </w:r>
+      <w:proofErr w:type="spellStart"/>
+      <w:r>
+        <w:rPr>
+          <w:rFonts w:ascii="Garamond" w:hAnsi="Garamond"/>
+          <w:sz w:val="24"/>
+          <w:szCs w:val="24"/>
+        </w:rPr>
+        <w:t>Hauri</w:t>
+      </w:r>
+      <w:proofErr w:type="spellEnd"/>
+      <w:r>
+        <w:rPr>
+          <w:rFonts w:ascii="Garamond" w:hAnsi="Garamond"/>
+          <w:sz w:val="24"/>
+          <w:szCs w:val="24"/>
+        </w:rPr>
+        <w:t>, E.</w:t>
+      </w:r>
+      <w:r>
+        <w:rPr>
+          <w:rFonts w:ascii="Garamond" w:hAnsi="Garamond"/>
+          <w:sz w:val="24"/>
+          <w:szCs w:val="24"/>
+        </w:rPr>
+        <w:t xml:space="preserve"> (2019). </w:t>
+      </w:r>
+      <w:r>
+        <w:rPr>
+          <w:rFonts w:ascii="Garamond" w:hAnsi="Garamond"/>
+          <w:sz w:val="24"/>
+          <w:szCs w:val="24"/>
+        </w:rPr>
+        <w:t>Water-in-olivine magma ascent chronometry: Every crystal is a clock</w:t>
+      </w:r>
+      <w:r>
+        <w:rPr>
+          <w:rFonts w:ascii="Garamond" w:hAnsi="Garamond"/>
+          <w:sz w:val="24"/>
+          <w:szCs w:val="24"/>
+        </w:rPr>
+        <w:t>. In review at</w:t>
+      </w:r>
+      <w:r>
+        <w:rPr>
+          <w:rFonts w:ascii="Garamond" w:hAnsi="Garamond"/>
+          <w:b/>
+          <w:sz w:val="24"/>
+          <w:szCs w:val="24"/>
+        </w:rPr>
+        <w:t xml:space="preserve"> </w:t>
+      </w:r>
+      <w:r>
+        <w:rPr>
+          <w:rFonts w:ascii="Garamond" w:hAnsi="Garamond"/>
+          <w:sz w:val="24"/>
+          <w:szCs w:val="24"/>
+        </w:rPr>
+        <w:t>Journal of Volcanology and Geothermal Research</w:t>
+      </w:r>
+    </w:p>
+    <w:p>
+      <w:pPr>
+        <w:rPr>
+          <w:rFonts w:ascii="Garamond" w:hAnsi="Garamond"/>
+          <w:b/>
+          <w:sz w:val="24"/>
+          <w:szCs w:val="24"/>
+        </w:rPr>
+      </w:pPr>
+    </w:p>
+    <w:p>
+      <w:pPr>
+        <w:rPr>
+          <w:rFonts w:ascii="Garamond" w:hAnsi="Garamond"/>
+          <w:sz w:val="24"/>
+          <w:szCs w:val="24"/>
+        </w:rPr>
+      </w:pPr>
+      <w:r>
+        <w:rPr>
+          <w:rFonts w:ascii="Garamond" w:hAnsi="Garamond"/>
+          <w:b/>
+          <w:sz w:val="24"/>
+          <w:szCs w:val="24"/>
+        </w:rPr>
         <w:t xml:space="preserve">Barth, A., </w:t>
       </w:r>
+      <w:r>
+        <w:rPr>
+          <w:rFonts w:ascii="Garamond" w:hAnsi="Garamond"/>
+          <w:sz w:val="24"/>
+          <w:szCs w:val="24"/>
+        </w:rPr>
+        <w:t xml:space="preserve">Newcombe, M., Plank, T., </w:t>
+      </w:r>
       <w:proofErr w:type="spellStart"/>
       <w:r>
         <w:rPr>
@@ -2430,7 +2679,7 @@
           <w:sz w:val="24"/>
           <w:szCs w:val="24"/>
         </w:rPr>
-        <w:t>Newcombe</w:t>
+        <w:t>Gonnermann</w:t>
       </w:r>
       <w:proofErr w:type="spellEnd"/>
       <w:r>
@@ -2439,7 +2688,7 @@
           <w:sz w:val="24"/>
           <w:szCs w:val="24"/>
         </w:rPr>
-        <w:t xml:space="preserve">, M., Plank, T., </w:t>
+        <w:t xml:space="preserve">, H., </w:t>
       </w:r>
       <w:proofErr w:type="spellStart"/>
       <w:r>
@@ -2448,7 +2697,7 @@
           <w:sz w:val="24"/>
           <w:szCs w:val="24"/>
         </w:rPr>
-        <w:t>Gonnermann</w:t>
+        <w:t>Hajimirza</w:t>
       </w:r>
       <w:proofErr w:type="spellEnd"/>
       <w:r>
@@ -2457,7 +2706,7 @@
           <w:sz w:val="24"/>
           <w:szCs w:val="24"/>
         </w:rPr>
-        <w:t xml:space="preserve">, H., Soto, G., </w:t>
+        <w:t xml:space="preserve">, S., Soto, G. J., ... &amp; </w:t>
       </w:r>
       <w:proofErr w:type="spellStart"/>
       <w:r>
@@ -2466,7 +2715,7 @@
           <w:sz w:val="24"/>
           <w:szCs w:val="24"/>
         </w:rPr>
-        <w:t>Saballos</w:t>
+        <w:t>Hauri</w:t>
       </w:r>
       <w:proofErr w:type="spellEnd"/>
       <w:r>
@@ -2475,67 +2724,7 @@
           <w:sz w:val="24"/>
           <w:szCs w:val="24"/>
         </w:rPr>
-        <w:t xml:space="preserve">, A., </w:t>
-      </w:r>
-      <w:proofErr w:type="spellStart"/>
-      <w:r>
-        <w:rPr>
-          <w:rFonts w:ascii="Garamond" w:hAnsi="Garamond"/>
-          <w:sz w:val="24"/>
-          <w:szCs w:val="24"/>
-        </w:rPr>
-        <w:t>Hauri</w:t>
-      </w:r>
-      <w:proofErr w:type="spellEnd"/>
-      <w:r>
-        <w:rPr>
-          <w:rFonts w:ascii="Garamond" w:hAnsi="Garamond"/>
-          <w:sz w:val="24"/>
-          <w:szCs w:val="24"/>
-        </w:rPr>
-        <w:t xml:space="preserve">, E., (In review) </w:t>
-      </w:r>
-      <w:r>
-        <w:rPr>
-          <w:rFonts w:ascii="Garamond" w:hAnsi="Garamond"/>
-          <w:sz w:val="24"/>
-          <w:szCs w:val="24"/>
-        </w:rPr>
-        <w:t xml:space="preserve">Magma decompression rate correlates with </w:t>
-      </w:r>
-      <w:proofErr w:type="spellStart"/>
-      <w:r>
-        <w:rPr>
-          <w:rFonts w:ascii="Garamond" w:hAnsi="Garamond"/>
-          <w:sz w:val="24"/>
-          <w:szCs w:val="24"/>
-        </w:rPr>
-        <w:t>expl</w:t>
-      </w:r>
-      <w:r>
-        <w:rPr>
-          <w:rFonts w:ascii="Garamond" w:hAnsi="Garamond"/>
-          <w:sz w:val="24"/>
-          <w:szCs w:val="24"/>
-        </w:rPr>
-        <w:t>osivity</w:t>
-      </w:r>
-      <w:proofErr w:type="spellEnd"/>
-      <w:r>
-        <w:rPr>
-          <w:rFonts w:ascii="Garamond" w:hAnsi="Garamond"/>
-          <w:sz w:val="24"/>
-          <w:szCs w:val="24"/>
-        </w:rPr>
-        <w:t xml:space="preserve"> at basaltic volcanoes – </w:t>
-      </w:r>
-      <w:r>
-        <w:rPr>
-          <w:rFonts w:ascii="Garamond" w:hAnsi="Garamond"/>
-          <w:sz w:val="24"/>
-          <w:szCs w:val="24"/>
-        </w:rPr>
-        <w:t>constraints from water diffusion in olivine</w:t>
+        <w:t>, E. (2019). Magma decompression rate correlates with explosivity at basaltic volcanoes—Constraints from water diffusion in olivine. Journal of Volcanology and Geothermal Research, 387, 106664.</w:t>
       </w:r>
     </w:p>
     <w:p>
@@ -2682,7 +2871,7 @@
 </file>
 
 <file path=word/styles.xml><?xml version="1.0" encoding="utf-8"?>
-<w:styles xmlns:mc="http://schemas.openxmlformats.org/markup-compatibility/2006" xmlns:r="http://schemas.openxmlformats.org/officeDocument/2006/relationships" xmlns:w="http://schemas.openxmlformats.org/wordprocessingml/2006/main" xmlns:w14="http://schemas.microsoft.com/office/word/2010/wordml" xmlns:w15="http://schemas.microsoft.com/office/word/2012/wordml" mc:Ignorable="w14 w15">
+<w:styles xmlns:mc="http://schemas.openxmlformats.org/markup-compatibility/2006" xmlns:r="http://schemas.openxmlformats.org/officeDocument/2006/relationships" xmlns:w="http://schemas.openxmlformats.org/wordprocessingml/2006/main" xmlns:w14="http://schemas.microsoft.com/office/word/2010/wordml" xmlns:w15="http://schemas.microsoft.com/office/word/2012/wordml" xmlns:w16cid="http://schemas.microsoft.com/office/word/2016/wordml/cid" xmlns:w16se="http://schemas.microsoft.com/office/word/2015/wordml/symex" mc:Ignorable="w14 w15 w16se w16cid">
   <w:docDefaults>
     <w:rPrDefault>
       <w:rPr>
@@ -2698,7 +2887,7 @@
       </w:pPr>
     </w:pPrDefault>
   </w:docDefaults>
-  <w:latentStyles w:defLockedState="0" w:defUIPriority="99" w:defSemiHidden="0" w:defUnhideWhenUsed="0" w:defQFormat="0" w:count="382">
+  <w:latentStyles w:defLockedState="0" w:defUIPriority="99" w:defSemiHidden="0" w:defUnhideWhenUsed="0" w:defQFormat="0" w:count="375">
     <w:lsdException w:name="Normal" w:uiPriority="0" w:qFormat="1"/>
     <w:lsdException w:name="heading 1" w:uiPriority="9" w:qFormat="1"/>
     <w:lsdException w:name="heading 2" w:semiHidden="1" w:uiPriority="9" w:unhideWhenUsed="1" w:qFormat="1"/>
@@ -2855,15 +3044,6 @@
     <w:lsdException w:name="Balloon Text" w:semiHidden="1" w:unhideWhenUsed="1"/>
     <w:lsdException w:name="Table Grid" w:uiPriority="59"/>
     <w:lsdException w:name="Table Theme" w:semiHidden="1" w:unhideWhenUsed="1"/>
-    <w:lsdException w:name="Note Level 1" w:semiHidden="1" w:unhideWhenUsed="1"/>
-    <w:lsdException w:name="Note Level 2" w:semiHidden="1" w:unhideWhenUsed="1"/>
-    <w:lsdException w:name="Note Level 3" w:semiHidden="1" w:unhideWhenUsed="1"/>
-    <w:lsdException w:name="Note Level 4" w:semiHidden="1" w:unhideWhenUsed="1"/>
-    <w:lsdException w:name="Note Level 5" w:semiHidden="1" w:unhideWhenUsed="1"/>
-    <w:lsdException w:name="Note Level 6" w:semiHidden="1" w:unhideWhenUsed="1"/>
-    <w:lsdException w:name="Note Level 7" w:semiHidden="1" w:unhideWhenUsed="1"/>
-    <w:lsdException w:name="Note Level 8" w:semiHidden="1" w:unhideWhenUsed="1"/>
-    <w:lsdException w:name="Note Level 9" w:semiHidden="1" w:unhideWhenUsed="1"/>
     <w:lsdException w:name="Placeholder Text" w:semiHidden="1"/>
     <w:lsdException w:name="No Spacing" w:uiPriority="1" w:qFormat="1"/>
     <w:lsdException w:name="Light Shading" w:uiPriority="60"/>
@@ -3514,7 +3694,7 @@
 </file>
 
 <file path=customXml/itemProps1.xml><?xml version="1.0" encoding="utf-8"?>
-<ds:datastoreItem xmlns:ds="http://schemas.openxmlformats.org/officeDocument/2006/customXml" ds:itemID="{46DC81E6-1975-4A4D-9386-124346C1C8B2}">
+<ds:datastoreItem xmlns:ds="http://schemas.openxmlformats.org/officeDocument/2006/customXml" ds:itemID="{56C12663-5269-C044-ABB0-481BC4FD10FF}">
   <ds:schemaRefs>
     <ds:schemaRef ds:uri="http://schemas.openxmlformats.org/officeDocument/2006/bibliography"/>
   </ds:schemaRefs>

</xml_diff>